<commit_message>
Refresh PyTorch and autoencoder example materials
</commit_message>
<xml_diff>
--- a/examples/autoencoder/doc/autoenc_adv_e.docx
+++ b/examples/autoencoder/doc/autoenc_adv_e.docx
@@ -79,7 +79,7 @@
         <w:rPr>
           <w:rStyle w:val="VerbatimChar"/>
         </w:rPr>
-        <w:t xml:space="preserve">num_epochs</w:t>
+        <w:t xml:space="preserve">epochs</w:t>
       </w:r>
       <w:r>
         <w:t xml:space="preserve">,</w:t>
@@ -791,7 +791,7 @@
         <w:rPr>
           <w:rStyle w:val="CommentTok"/>
         </w:rPr>
-        <w:t xml:space="preserve"># - num_epochs: number of training epochs</w:t>
+        <w:t xml:space="preserve"># - epochs: number of training epochs</w:t>
       </w:r>
       <w:r>
         <w:br/>
@@ -878,7 +878,7 @@
         <w:rPr>
           <w:rStyle w:val="AttributeTok"/>
         </w:rPr>
-        <w:t xml:space="preserve">num_epochs =</w:t>
+        <w:t xml:space="preserve">epochs =</w:t>
       </w:r>
       <w:r>
         <w:rPr>
@@ -942,6 +942,185 @@
           <w:rStyle w:val="NormalTok"/>
         </w:rPr>
         <w:t xml:space="preserve">(auto, train)</w:t>
+      </w:r>
+    </w:p>
+    <w:p>
+      <w:pPr>
+        <w:pStyle w:val="FirstParagraph"/>
+      </w:pPr>
+      <w:r>
+        <w:t xml:space="preserve">Constructor configuration</w:t>
+      </w:r>
+      <w:r>
+        <w:t xml:space="preserve"> </w:t>
+      </w:r>
+      <w:r>
+        <w:t xml:space="preserve">- Fixed-epoch baseline: set</w:t>
+      </w:r>
+      <w:r>
+        <w:t xml:space="preserve"> </w:t>
+      </w:r>
+      <w:r>
+        <w:rPr>
+          <w:rStyle w:val="VerbatimChar"/>
+        </w:rPr>
+        <w:t xml:space="preserve">epochs</w:t>
+      </w:r>
+      <w:r>
+        <w:t xml:space="preserve"> </w:t>
+      </w:r>
+      <w:r>
+        <w:t xml:space="preserve">and keep</w:t>
+      </w:r>
+      <w:r>
+        <w:t xml:space="preserve"> </w:t>
+      </w:r>
+      <w:r>
+        <w:rPr>
+          <w:rStyle w:val="VerbatimChar"/>
+        </w:rPr>
+        <w:t xml:space="preserve">validation_strategy = "static"</w:t>
+      </w:r>
+      <w:r>
+        <w:t xml:space="preserve"> </w:t>
+      </w:r>
+      <w:r>
+        <w:t xml:space="preserve">with</w:t>
+      </w:r>
+      <w:r>
+        <w:t xml:space="preserve"> </w:t>
+      </w:r>
+      <w:r>
+        <w:rPr>
+          <w:rStyle w:val="VerbatimChar"/>
+        </w:rPr>
+        <w:t xml:space="preserve">stopping_rule = "none"</w:t>
+      </w:r>
+      <w:r>
+        <w:t xml:space="preserve">.</w:t>
+      </w:r>
+      <w:r>
+        <w:t xml:space="preserve"> </w:t>
+      </w:r>
+      <w:r>
+        <w:t xml:space="preserve">- Static early stopping: keep</w:t>
+      </w:r>
+      <w:r>
+        <w:t xml:space="preserve"> </w:t>
+      </w:r>
+      <w:r>
+        <w:rPr>
+          <w:rStyle w:val="VerbatimChar"/>
+        </w:rPr>
+        <w:t xml:space="preserve">validation_strategy = "static"</w:t>
+      </w:r>
+      <w:r>
+        <w:t xml:space="preserve"> </w:t>
+      </w:r>
+      <w:r>
+        <w:t xml:space="preserve">and choose</w:t>
+      </w:r>
+      <w:r>
+        <w:t xml:space="preserve"> </w:t>
+      </w:r>
+      <w:r>
+        <w:rPr>
+          <w:rStyle w:val="VerbatimChar"/>
+        </w:rPr>
+        <w:t xml:space="preserve">stopping_rule = "patience"</w:t>
+      </w:r>
+      <w:r>
+        <w:t xml:space="preserve">,</w:t>
+      </w:r>
+      <w:r>
+        <w:t xml:space="preserve"> </w:t>
+      </w:r>
+      <w:r>
+        <w:rPr>
+          <w:rStyle w:val="VerbatimChar"/>
+        </w:rPr>
+        <w:t xml:space="preserve">"sma"</w:t>
+      </w:r>
+      <w:r>
+        <w:t xml:space="preserve">,</w:t>
+      </w:r>
+      <w:r>
+        <w:t xml:space="preserve"> </w:t>
+      </w:r>
+      <w:r>
+        <w:rPr>
+          <w:rStyle w:val="VerbatimChar"/>
+        </w:rPr>
+        <w:t xml:space="preserve">"ema"</w:t>
+      </w:r>
+      <w:r>
+        <w:t xml:space="preserve">, or</w:t>
+      </w:r>
+      <w:r>
+        <w:t xml:space="preserve"> </w:t>
+      </w:r>
+      <w:r>
+        <w:rPr>
+          <w:rStyle w:val="VerbatimChar"/>
+        </w:rPr>
+        <w:t xml:space="preserve">"h"</w:t>
+      </w:r>
+      <w:r>
+        <w:t xml:space="preserve">.</w:t>
+      </w:r>
+      <w:r>
+        <w:t xml:space="preserve"> </w:t>
+      </w:r>
+      <w:r>
+        <w:t xml:space="preserve">- Dynamic early stopping: switch</w:t>
+      </w:r>
+      <w:r>
+        <w:t xml:space="preserve"> </w:t>
+      </w:r>
+      <w:r>
+        <w:rPr>
+          <w:rStyle w:val="VerbatimChar"/>
+        </w:rPr>
+        <w:t xml:space="preserve">validation_strategy = "dynamic"</w:t>
+      </w:r>
+      <w:r>
+        <w:t xml:space="preserve"> </w:t>
+      </w:r>
+      <w:r>
+        <w:t xml:space="preserve">and reuse the same stopping rules.</w:t>
+      </w:r>
+      <w:r>
+        <w:t xml:space="preserve"> </w:t>
+      </w:r>
+      <w:r>
+        <w:t xml:space="preserve">- The loss plot below always shows</w:t>
+      </w:r>
+      <w:r>
+        <w:t xml:space="preserve"> </w:t>
+      </w:r>
+      <w:r>
+        <w:rPr>
+          <w:rStyle w:val="VerbatimChar"/>
+        </w:rPr>
+        <w:t xml:space="preserve">train_loss</w:t>
+      </w:r>
+      <w:r>
+        <w:t xml:space="preserve">; it adds</w:t>
+      </w:r>
+      <w:r>
+        <w:t xml:space="preserve"> </w:t>
+      </w:r>
+      <w:r>
+        <w:rPr>
+          <w:rStyle w:val="VerbatimChar"/>
+        </w:rPr>
+        <w:t xml:space="preserve">val_loss</w:t>
+      </w:r>
+      <w:r>
+        <w:t xml:space="preserve"> </w:t>
+      </w:r>
+      <w:r>
+        <w:t xml:space="preserve">when validation is active.</w:t>
       </w:r>
     </w:p>
     <w:p>
@@ -1449,7 +1628,7 @@
               <a:graphicData uri="http://schemas.openxmlformats.org/drawingml/2006/picture">
                 <pic:pic>
                   <pic:nvPicPr>
-                    <pic:cNvPr descr="C:\Git\dal\daltoolboxdp\examples\autoencoder\doc\autoenc_adv_e_files/f092827bac36fa6a06167a4d8b2edca26568ea3a.png" id="11" name="Picture"/>
+                    <pic:cNvPr descr="C:\Git\dal\daltoolboxdp\examples\autoencoder\doc\autoenc_adv_e_files/de0aa6d1723350b5590c57a85be2055c366b59db.png" id="11" name="Picture"/>
                     <pic:cNvPicPr>
                       <a:picLocks noChangeArrowheads="1" noChangeAspect="1"/>
                     </pic:cNvPicPr>
@@ -1664,61 +1843,61 @@
         <w:rPr>
           <w:rStyle w:val="VerbatimChar"/>
         </w:rPr>
-        <w:t xml:space="preserve">##            [,1]      [,2]      [,3]</w:t>
-      </w:r>
-      <w:r>
-        <w:br/>
-      </w:r>
-      <w:r>
-        <w:rPr>
-          <w:rStyle w:val="VerbatimChar"/>
-        </w:rPr>
-        <w:t xml:space="preserve">## [1,]  4.2359324 -3.786194 -3.387487</w:t>
-      </w:r>
-      <w:r>
-        <w:br/>
-      </w:r>
-      <w:r>
-        <w:rPr>
-          <w:rStyle w:val="VerbatimChar"/>
-        </w:rPr>
-        <w:t xml:space="preserve">## [2,]  3.1789834 -5.089138 -4.084356</w:t>
-      </w:r>
-      <w:r>
-        <w:br/>
-      </w:r>
-      <w:r>
-        <w:rPr>
-          <w:rStyle w:val="VerbatimChar"/>
-        </w:rPr>
-        <w:t xml:space="preserve">## [3,]  1.9306998 -5.901231 -4.613087</w:t>
-      </w:r>
-      <w:r>
-        <w:br/>
-      </w:r>
-      <w:r>
-        <w:rPr>
-          <w:rStyle w:val="VerbatimChar"/>
-        </w:rPr>
-        <w:t xml:space="preserve">## [4,]  0.6903353 -6.243255 -4.951740</w:t>
-      </w:r>
-      <w:r>
-        <w:br/>
-      </w:r>
-      <w:r>
-        <w:rPr>
-          <w:rStyle w:val="VerbatimChar"/>
-        </w:rPr>
-        <w:t xml:space="preserve">## [5,] -0.6409256 -6.204493 -5.153868</w:t>
-      </w:r>
-      <w:r>
-        <w:br/>
-      </w:r>
-      <w:r>
-        <w:rPr>
-          <w:rStyle w:val="VerbatimChar"/>
-        </w:rPr>
-        <w:t xml:space="preserve">## [6,] -1.9742749 -5.743860 -5.169721</w:t>
+        <w:t xml:space="preserve">##            [,1]         [,2]      [,3]</w:t>
+      </w:r>
+      <w:r>
+        <w:br/>
+      </w:r>
+      <w:r>
+        <w:rPr>
+          <w:rStyle w:val="VerbatimChar"/>
+        </w:rPr>
+        <w:t xml:space="preserve">## [1,] -1.3996564 -0.002828192  9.048203</w:t>
+      </w:r>
+      <w:r>
+        <w:br/>
+      </w:r>
+      <w:r>
+        <w:rPr>
+          <w:rStyle w:val="VerbatimChar"/>
+        </w:rPr>
+        <w:t xml:space="preserve">## [2,] -1.7269700 -0.179698095  9.679373</w:t>
+      </w:r>
+      <w:r>
+        <w:br/>
+      </w:r>
+      <w:r>
+        <w:rPr>
+          <w:rStyle w:val="VerbatimChar"/>
+        </w:rPr>
+        <w:t xml:space="preserve">## [3,] -1.7273977 -0.235832825  9.996643</w:t>
+      </w:r>
+      <w:r>
+        <w:br/>
+      </w:r>
+      <w:r>
+        <w:rPr>
+          <w:rStyle w:val="VerbatimChar"/>
+        </w:rPr>
+        <w:t xml:space="preserve">## [4,] -1.4853786 -0.217360094 10.047136</w:t>
+      </w:r>
+      <w:r>
+        <w:br/>
+      </w:r>
+      <w:r>
+        <w:rPr>
+          <w:rStyle w:val="VerbatimChar"/>
+        </w:rPr>
+        <w:t xml:space="preserve">## [5,] -1.0387126 -0.142944932  9.823874</w:t>
+      </w:r>
+      <w:r>
+        <w:br/>
+      </w:r>
+      <w:r>
+        <w:rPr>
+          <w:rStyle w:val="VerbatimChar"/>
+        </w:rPr>
+        <w:t xml:space="preserve">## [6,] -0.3830115 -0.009843539  9.331919</w:t>
       </w:r>
     </w:p>
     <w:p>

</xml_diff>

<commit_message>
Refresh examples after torch classifier output fix
</commit_message>
<xml_diff>
--- a/examples/autoencoder/doc/autoenc_adv_e.docx
+++ b/examples/autoencoder/doc/autoenc_adv_e.docx
@@ -791,7 +791,7 @@
         <w:rPr>
           <w:rStyle w:val="CommentTok"/>
         </w:rPr>
-        <w:t xml:space="preserve"># - epochs: number of training epochs</w:t>
+        <w:t xml:space="preserve"># - the default number of epochs is used</w:t>
       </w:r>
       <w:r>
         <w:br/>
@@ -867,30 +867,6 @@
           <w:rStyle w:val="DecValTok"/>
         </w:rPr>
         <w:t xml:space="preserve">3</w:t>
-      </w:r>
-      <w:r>
-        <w:rPr>
-          <w:rStyle w:val="NormalTok"/>
-        </w:rPr>
-        <w:t xml:space="preserve">, </w:t>
-      </w:r>
-      <w:r>
-        <w:rPr>
-          <w:rStyle w:val="AttributeTok"/>
-        </w:rPr>
-        <w:t xml:space="preserve">epochs =</w:t>
-      </w:r>
-      <w:r>
-        <w:rPr>
-          <w:rStyle w:val="NormalTok"/>
-        </w:rPr>
-        <w:t xml:space="preserve"> </w:t>
-      </w:r>
-      <w:r>
-        <w:rPr>
-          <w:rStyle w:val="DecValTok"/>
-        </w:rPr>
-        <w:t xml:space="preserve">1500</w:t>
       </w:r>
       <w:r>
         <w:rPr>
@@ -955,7 +931,7 @@
         <w:t xml:space="preserve"> </w:t>
       </w:r>
       <w:r>
-        <w:t xml:space="preserve">- Fixed-epoch baseline: set</w:t>
+        <w:t xml:space="preserve">- Fixed-epoch baseline: omit</w:t>
       </w:r>
       <w:r>
         <w:t xml:space="preserve"> </w:t>
@@ -970,7 +946,7 @@
         <w:t xml:space="preserve"> </w:t>
       </w:r>
       <w:r>
-        <w:t xml:space="preserve">and keep</w:t>
+        <w:t xml:space="preserve">to use the default value and keep</w:t>
       </w:r>
       <w:r>
         <w:t xml:space="preserve"> </w:t>
@@ -1628,7 +1604,7 @@
               <a:graphicData uri="http://schemas.openxmlformats.org/drawingml/2006/picture">
                 <pic:pic>
                   <pic:nvPicPr>
-                    <pic:cNvPr descr="C:\Git\dal\daltoolboxdp\examples\autoencoder\doc\autoenc_adv_e_files/de0aa6d1723350b5590c57a85be2055c366b59db.png" id="11" name="Picture"/>
+                    <pic:cNvPr descr="C:\Git\dal\daltoolboxdp\examples\autoencoder\doc\autoenc_adv_e_files/1528b1299a3b3f3ef3af8fe4d3bd9cc30b6d52b7.png" id="11" name="Picture"/>
                     <pic:cNvPicPr>
                       <a:picLocks noChangeArrowheads="1" noChangeAspect="1"/>
                     </pic:cNvPicPr>
@@ -1843,61 +1819,61 @@
         <w:rPr>
           <w:rStyle w:val="VerbatimChar"/>
         </w:rPr>
-        <w:t xml:space="preserve">##            [,1]         [,2]      [,3]</w:t>
-      </w:r>
-      <w:r>
-        <w:br/>
-      </w:r>
-      <w:r>
-        <w:rPr>
-          <w:rStyle w:val="VerbatimChar"/>
-        </w:rPr>
-        <w:t xml:space="preserve">## [1,] -1.3996564 -0.002828192  9.048203</w:t>
-      </w:r>
-      <w:r>
-        <w:br/>
-      </w:r>
-      <w:r>
-        <w:rPr>
-          <w:rStyle w:val="VerbatimChar"/>
-        </w:rPr>
-        <w:t xml:space="preserve">## [2,] -1.7269700 -0.179698095  9.679373</w:t>
-      </w:r>
-      <w:r>
-        <w:br/>
-      </w:r>
-      <w:r>
-        <w:rPr>
-          <w:rStyle w:val="VerbatimChar"/>
-        </w:rPr>
-        <w:t xml:space="preserve">## [3,] -1.7273977 -0.235832825  9.996643</w:t>
-      </w:r>
-      <w:r>
-        <w:br/>
-      </w:r>
-      <w:r>
-        <w:rPr>
-          <w:rStyle w:val="VerbatimChar"/>
-        </w:rPr>
-        <w:t xml:space="preserve">## [4,] -1.4853786 -0.217360094 10.047136</w:t>
-      </w:r>
-      <w:r>
-        <w:br/>
-      </w:r>
-      <w:r>
-        <w:rPr>
-          <w:rStyle w:val="VerbatimChar"/>
-        </w:rPr>
-        <w:t xml:space="preserve">## [5,] -1.0387126 -0.142944932  9.823874</w:t>
-      </w:r>
-      <w:r>
-        <w:br/>
-      </w:r>
-      <w:r>
-        <w:rPr>
-          <w:rStyle w:val="VerbatimChar"/>
-        </w:rPr>
-        <w:t xml:space="preserve">## [6,] -0.3830115 -0.009843539  9.331919</w:t>
+        <w:t xml:space="preserve">##           [,1]       [,2]      [,3]</w:t>
+      </w:r>
+      <w:r>
+        <w:br/>
+      </w:r>
+      <w:r>
+        <w:rPr>
+          <w:rStyle w:val="VerbatimChar"/>
+        </w:rPr>
+        <w:t xml:space="preserve">## [1,] -2.920094 -0.7245675 0.1129475</w:t>
+      </w:r>
+      <w:r>
+        <w:br/>
+      </w:r>
+      <w:r>
+        <w:rPr>
+          <w:rStyle w:val="VerbatimChar"/>
+        </w:rPr>
+        <w:t xml:space="preserve">## [2,] -3.098821 -0.7472187 0.1338255</w:t>
+      </w:r>
+      <w:r>
+        <w:br/>
+      </w:r>
+      <w:r>
+        <w:rPr>
+          <w:rStyle w:val="VerbatimChar"/>
+        </w:rPr>
+        <w:t xml:space="preserve">## [3,] -3.169246 -0.7524545 0.1453852</w:t>
+      </w:r>
+      <w:r>
+        <w:br/>
+      </w:r>
+      <w:r>
+        <w:rPr>
+          <w:rStyle w:val="VerbatimChar"/>
+        </w:rPr>
+        <w:t xml:space="preserve">## [4,] -3.130394 -0.7388405 0.1467551</w:t>
+      </w:r>
+      <w:r>
+        <w:br/>
+      </w:r>
+      <w:r>
+        <w:rPr>
+          <w:rStyle w:val="VerbatimChar"/>
+        </w:rPr>
+        <w:t xml:space="preserve">## [5,] -2.989799 -0.7081395 0.1367446</w:t>
+      </w:r>
+      <w:r>
+        <w:br/>
+      </w:r>
+      <w:r>
+        <w:rPr>
+          <w:rStyle w:val="VerbatimChar"/>
+        </w:rPr>
+        <w:t xml:space="preserve">## [6,] -2.740845 -0.6598958 0.1104506</w:t>
       </w:r>
     </w:p>
     <w:p>

</xml_diff>

<commit_message>
Refresh generated examples and package version
</commit_message>
<xml_diff>
--- a/examples/autoencoder/doc/autoenc_adv_e.docx
+++ b/examples/autoencoder/doc/autoenc_adv_e.docx
@@ -1750,7 +1750,7 @@
               <a:graphicData uri="http://schemas.openxmlformats.org/drawingml/2006/picture">
                 <pic:pic>
                   <pic:nvPicPr>
-                    <pic:cNvPr descr="/home/gpca/daltoolboxdp/examples/autoencoder/doc/autoenc_adv_e_files/0d117e6a5db24010e8c956925419d6dec65d86a5.png" id="11" name="Picture"/>
+                    <pic:cNvPr descr="C:\Git\dal\daltoolboxdp\examples\autoencoder\doc\autoenc_adv_e_files/5410a1bb0143954daae2bfd1f6b7ac444db44f54.png" id="11" name="Picture"/>
                     <pic:cNvPicPr>
                       <a:picLocks noChangeArrowheads="1" noChangeAspect="1"/>
                     </pic:cNvPicPr>
@@ -1965,61 +1965,61 @@
         <w:rPr>
           <w:rStyle w:val="VerbatimChar"/>
         </w:rPr>
-        <w:t xml:space="preserve">##          [,1]      [,2]     [,3]</w:t>
-      </w:r>
-      <w:r>
-        <w:br/>
-      </w:r>
-      <w:r>
-        <w:rPr>
-          <w:rStyle w:val="VerbatimChar"/>
-        </w:rPr>
-        <w:t xml:space="preserve">## [1,] 5.506738 -4.848926 2.223361</w:t>
-      </w:r>
-      <w:r>
-        <w:br/>
-      </w:r>
-      <w:r>
-        <w:rPr>
-          <w:rStyle w:val="VerbatimChar"/>
-        </w:rPr>
-        <w:t xml:space="preserve">## [2,] 6.059570 -5.298820 1.971168</w:t>
-      </w:r>
-      <w:r>
-        <w:br/>
-      </w:r>
-      <w:r>
-        <w:rPr>
-          <w:rStyle w:val="VerbatimChar"/>
-        </w:rPr>
-        <w:t xml:space="preserve">## [3,] 6.315296 -5.498214 1.853571</w:t>
-      </w:r>
-      <w:r>
-        <w:br/>
-      </w:r>
-      <w:r>
-        <w:rPr>
-          <w:rStyle w:val="VerbatimChar"/>
-        </w:rPr>
-        <w:t xml:space="preserve">## [4,] 6.249838 -5.426584 1.890358</w:t>
-      </w:r>
-      <w:r>
-        <w:br/>
-      </w:r>
-      <w:r>
-        <w:rPr>
-          <w:rStyle w:val="VerbatimChar"/>
-        </w:rPr>
-        <w:t xml:space="preserve">## [5,] 5.884594 -5.103698 2.045660</w:t>
-      </w:r>
-      <w:r>
-        <w:br/>
-      </w:r>
-      <w:r>
-        <w:rPr>
-          <w:rStyle w:val="VerbatimChar"/>
-        </w:rPr>
-        <w:t xml:space="preserve">## [6,] 5.238298 -4.544466 2.319767</w:t>
+        <w:t xml:space="preserve">##          [,1]     [,2]      [,3]</w:t>
+      </w:r>
+      <w:r>
+        <w:br/>
+      </w:r>
+      <w:r>
+        <w:rPr>
+          <w:rStyle w:val="VerbatimChar"/>
+        </w:rPr>
+        <w:t xml:space="preserve">## [1,] 3.660584 1.410457 -8.334830</w:t>
+      </w:r>
+      <w:r>
+        <w:br/>
+      </w:r>
+      <w:r>
+        <w:rPr>
+          <w:rStyle w:val="VerbatimChar"/>
+        </w:rPr>
+        <w:t xml:space="preserve">## [2,] 3.891997 1.286600 -8.877394</w:t>
+      </w:r>
+      <w:r>
+        <w:br/>
+      </w:r>
+      <w:r>
+        <w:rPr>
+          <w:rStyle w:val="VerbatimChar"/>
+        </w:rPr>
+        <w:t xml:space="preserve">## [3,] 3.985007 1.238071 -9.092201</w:t>
+      </w:r>
+      <w:r>
+        <w:br/>
+      </w:r>
+      <w:r>
+        <w:rPr>
+          <w:rStyle w:val="VerbatimChar"/>
+        </w:rPr>
+        <w:t xml:space="preserve">## [4,] 3.934671 1.259421 -8.972046</w:t>
+      </w:r>
+      <w:r>
+        <w:br/>
+      </w:r>
+      <w:r>
+        <w:rPr>
+          <w:rStyle w:val="VerbatimChar"/>
+        </w:rPr>
+        <w:t xml:space="preserve">## [5,] 3.744750 1.354276 -8.521355</w:t>
+      </w:r>
+      <w:r>
+        <w:br/>
+      </w:r>
+      <w:r>
+        <w:rPr>
+          <w:rStyle w:val="VerbatimChar"/>
+        </w:rPr>
+        <w:t xml:space="preserve">## [6,] 3.411400 1.601696 -7.704987</w:t>
       </w:r>
     </w:p>
     <w:p>

</xml_diff>